<commit_message>
Auto Daily 8:00 PM Dashboard Update [2026-10-20 20:14]
</commit_message>
<xml_diff>
--- a/docs/weekly/2026-W43_當週執行率回顧報告.docx
+++ b/docs/weekly/2026-W43_當週執行率回顧報告.docx
@@ -21,7 +21,7 @@
           <w:color w:val="555555"/>
           <w:sz w:val="20"/>
         </w:rPr>
-        <w:t>週期：2026/10/19–2026/10/25　｜　整體時間執行率：0.0%</w:t>
+        <w:t>週期：2026/10/19–2026/10/25　｜　整體時間執行率：13.0%</w:t>
       </w:r>
     </w:p>
     <w:p>
@@ -538,7 +538,7 @@
                 <w:color w:val="000000"/>
                 <w:sz w:val="19"/>
               </w:rPr>
-              <w:t>3.50 hr</w:t>
+              <w:t>3.00 hr</w:t>
             </w:r>
           </w:p>
         </w:tc>
@@ -619,7 +619,7 @@
                 <w:color w:val="000000"/>
                 <w:sz w:val="19"/>
               </w:rPr>
-              <w:t>73.00 km</w:t>
+              <w:t>-</w:t>
             </w:r>
           </w:p>
         </w:tc>
@@ -673,7 +673,7 @@
                 <w:color w:val="000000"/>
                 <w:sz w:val="19"/>
               </w:rPr>
-              <w:t>0.0%</w:t>
+              <w:t>-</w:t>
             </w:r>
           </w:p>
         </w:tc>
@@ -756,7 +756,7 @@
                 <w:color w:val="000000"/>
                 <w:sz w:val="19"/>
               </w:rPr>
-              <w:t>3.17 hr</w:t>
+              <w:t>3.00 hr</w:t>
             </w:r>
           </w:p>
         </w:tc>
@@ -783,7 +783,7 @@
                 <w:color w:val="000000"/>
                 <w:sz w:val="19"/>
               </w:rPr>
-              <w:t>0.00 hr</w:t>
+              <w:t>1.17 hr</w:t>
             </w:r>
           </w:p>
         </w:tc>
@@ -810,7 +810,7 @@
                 <w:color w:val="000000"/>
                 <w:sz w:val="19"/>
               </w:rPr>
-              <w:t>0.0%</w:t>
+              <w:t>38.9%</w:t>
             </w:r>
           </w:p>
         </w:tc>
@@ -864,7 +864,7 @@
                 <w:color w:val="000000"/>
                 <w:sz w:val="19"/>
               </w:rPr>
-              <w:t>0.00 km</w:t>
+              <w:t>10.32 km</w:t>
             </w:r>
           </w:p>
         </w:tc>
@@ -891,7 +891,7 @@
                 <w:color w:val="000000"/>
                 <w:sz w:val="19"/>
               </w:rPr>
-              <w:t>0.0%</w:t>
+              <w:t>107.5%</w:t>
             </w:r>
           </w:p>
         </w:tc>
@@ -1631,7 +1631,7 @@
                 <w:color w:val="000000"/>
                 <w:sz w:val="19"/>
               </w:rPr>
-              <w:t>0分</w:t>
+              <w:t>70分 / 10.32km</w:t>
             </w:r>
           </w:p>
         </w:tc>
@@ -1658,7 +1658,7 @@
                 <w:color w:val="000000"/>
                 <w:sz w:val="19"/>
               </w:rPr>
-              <w:t>❌ 未執行/待排程</w:t>
+              <w:t>✅ 精準達標 (100%, A+)</w:t>
             </w:r>
           </w:p>
         </w:tc>
@@ -2380,7 +2380,7 @@
                 <w:color w:val="000000"/>
                 <w:sz w:val="19"/>
               </w:rPr>
-              <w:t>Bike: 大安～三芝 7～大安</w:t>
+              <w:t>Bike: TEMPO 3x12</w:t>
             </w:r>
           </w:p>
         </w:tc>
@@ -2434,7 +2434,7 @@
                 <w:color w:val="000000"/>
                 <w:sz w:val="19"/>
               </w:rPr>
-              <w:t>150分 / 73.00km</w:t>
+              <w:t>120分</w:t>
             </w:r>
           </w:p>
         </w:tc>
@@ -2600,7 +2600,7 @@
                 <w:color w:val="000000"/>
                 <w:sz w:val="19"/>
               </w:rPr>
-              <w:t>30分</w:t>
+              <w:t>20分</w:t>
             </w:r>
           </w:p>
         </w:tc>
@@ -3013,7 +3013,7 @@
     </w:p>
     <w:p>
       <w:r>
-        <w:t>• 當週累積自行車 0.00 km、跑步 0.00 km、游泳 0.00 km，整體時間執行率達 0.0%。</w:t>
+        <w:t>• 當週累積自行車 0.00 km、跑步 10.32 km、游泳 0.00 km，整體時間執行率達 13.0%。</w:t>
         <w:br/>
       </w:r>
       <w:r>

</xml_diff>

<commit_message>
Auto Daily 8:00 PM Dashboard Update [2026-10-22 20:00]
</commit_message>
<xml_diff>
--- a/docs/weekly/2026-W43_當週執行率回顧報告.docx
+++ b/docs/weekly/2026-W43_當週執行率回顧報告.docx
@@ -21,7 +21,7 @@
           <w:color w:val="555555"/>
           <w:sz w:val="20"/>
         </w:rPr>
-        <w:t>週期：2026/10/19–2026/10/25　｜　整體時間執行率：13.0%</w:t>
+        <w:t>週期：2026/10/19–2026/10/25　｜　整體時間執行率：32.0%</w:t>
       </w:r>
     </w:p>
     <w:p>
@@ -347,7 +347,7 @@
                 <w:color w:val="000000"/>
                 <w:sz w:val="19"/>
               </w:rPr>
-              <w:t>0.00 hr</w:t>
+              <w:t>1.03 hr</w:t>
             </w:r>
           </w:p>
         </w:tc>
@@ -374,7 +374,7 @@
                 <w:color w:val="000000"/>
                 <w:sz w:val="19"/>
               </w:rPr>
-              <w:t>0.0%</w:t>
+              <w:t>34.4%</w:t>
             </w:r>
           </w:p>
         </w:tc>
@@ -428,7 +428,7 @@
                 <w:color w:val="000000"/>
                 <w:sz w:val="19"/>
               </w:rPr>
-              <w:t>0.00 km</w:t>
+              <w:t>3.10 km</w:t>
             </w:r>
           </w:p>
         </w:tc>
@@ -455,7 +455,7 @@
                 <w:color w:val="000000"/>
                 <w:sz w:val="19"/>
               </w:rPr>
-              <w:t>0.0%</w:t>
+              <w:t>134.8%</w:t>
             </w:r>
           </w:p>
         </w:tc>
@@ -538,7 +538,7 @@
                 <w:color w:val="000000"/>
                 <w:sz w:val="19"/>
               </w:rPr>
-              <w:t>3.00 hr</w:t>
+              <w:t>4.00 hr</w:t>
             </w:r>
           </w:p>
         </w:tc>
@@ -565,7 +565,7 @@
                 <w:color w:val="000000"/>
                 <w:sz w:val="19"/>
               </w:rPr>
-              <w:t>0.00 hr</w:t>
+              <w:t>1.00 hr</w:t>
             </w:r>
           </w:p>
         </w:tc>
@@ -592,7 +592,7 @@
                 <w:color w:val="000000"/>
                 <w:sz w:val="19"/>
               </w:rPr>
-              <w:t>0.0%</w:t>
+              <w:t>25.0%</w:t>
             </w:r>
           </w:p>
         </w:tc>
@@ -646,7 +646,7 @@
                 <w:color w:val="000000"/>
                 <w:sz w:val="19"/>
               </w:rPr>
-              <w:t>0.00 km</w:t>
+              <w:t>33.55 km</w:t>
             </w:r>
           </w:p>
         </w:tc>
@@ -700,7 +700,7 @@
                 <w:color w:val="000000"/>
                 <w:sz w:val="19"/>
               </w:rPr>
-              <w:t>2</w:t>
+              <w:t>3</w:t>
             </w:r>
           </w:p>
         </w:tc>
@@ -1797,7 +1797,7 @@
                 <w:color w:val="000000"/>
                 <w:sz w:val="19"/>
               </w:rPr>
-              <w:t>0分</w:t>
+              <w:t>62分 / 3.10km</w:t>
             </w:r>
           </w:p>
         </w:tc>
@@ -1824,7 +1824,7 @@
                 <w:color w:val="000000"/>
                 <w:sz w:val="19"/>
               </w:rPr>
-              <w:t>❌ 未執行/待排程</w:t>
+              <w:t>✅ 精準達標 (103%, A+)</w:t>
             </w:r>
           </w:p>
         </w:tc>
@@ -1963,7 +1963,7 @@
                 <w:color w:val="000000"/>
                 <w:sz w:val="19"/>
               </w:rPr>
-              <w:t>0分</w:t>
+              <w:t>60分 / 33.55km</w:t>
             </w:r>
           </w:p>
         </w:tc>
@@ -1990,7 +1990,7 @@
                 <w:color w:val="000000"/>
                 <w:sz w:val="19"/>
               </w:rPr>
-              <w:t>❌ 未執行/待排程</w:t>
+              <w:t>✅ 精準達標 (100%, A+)</w:t>
             </w:r>
           </w:p>
         </w:tc>
@@ -2103,6 +2103,172 @@
                 <w:sz w:val="19"/>
               </w:rPr>
               <w:t>15分</w:t>
+            </w:r>
+          </w:p>
+        </w:tc>
+        <w:tc>
+          <w:tcPr>
+            <w:tcW w:type="dxa" w:w="1500"/>
+            <w:tcMar>
+              <w:top w:w="80" w:type="dxa"/>
+              <w:start w:w="120" w:type="dxa"/>
+              <w:bottom w:w="80" w:type="dxa"/>
+              <w:end w:w="120" w:type="dxa"/>
+            </w:tcMar>
+            <w:vAlign w:val="center"/>
+          </w:tcPr>
+          <w:p>
+            <w:pPr>
+              <w:spacing w:after="0"/>
+              <w:jc w:val="center"/>
+            </w:pPr>
+            <w:r>
+              <w:rPr>
+                <w:rFonts w:ascii="Calibri" w:hAnsi="Calibri" w:eastAsia="Microsoft JhengHei"/>
+                <w:b w:val="0"/>
+                <w:color w:val="000000"/>
+                <w:sz w:val="19"/>
+              </w:rPr>
+              <w:t>0分</w:t>
+            </w:r>
+          </w:p>
+        </w:tc>
+        <w:tc>
+          <w:tcPr>
+            <w:tcW w:type="dxa" w:w="1810"/>
+            <w:tcMar>
+              <w:top w:w="80" w:type="dxa"/>
+              <w:start w:w="120" w:type="dxa"/>
+              <w:bottom w:w="80" w:type="dxa"/>
+              <w:end w:w="120" w:type="dxa"/>
+            </w:tcMar>
+            <w:vAlign w:val="center"/>
+          </w:tcPr>
+          <w:p>
+            <w:pPr>
+              <w:spacing w:after="0"/>
+              <w:jc w:val="center"/>
+            </w:pPr>
+            <w:r>
+              <w:rPr>
+                <w:rFonts w:ascii="Calibri" w:hAnsi="Calibri" w:eastAsia="Microsoft JhengHei"/>
+                <w:b w:val="0"/>
+                <w:color w:val="000000"/>
+                <w:sz w:val="19"/>
+              </w:rPr>
+              <w:t>❌ 未執行/待排程</w:t>
+            </w:r>
+          </w:p>
+        </w:tc>
+      </w:tr>
+      <w:tr>
+        <w:tc>
+          <w:tcPr>
+            <w:tcW w:type="dxa" w:w="1050"/>
+            <w:tcMar>
+              <w:top w:w="80" w:type="dxa"/>
+              <w:start w:w="120" w:type="dxa"/>
+              <w:bottom w:w="80" w:type="dxa"/>
+              <w:end w:w="120" w:type="dxa"/>
+            </w:tcMar>
+            <w:vAlign w:val="center"/>
+          </w:tcPr>
+          <w:p>
+            <w:pPr>
+              <w:spacing w:after="0"/>
+              <w:jc w:val="center"/>
+            </w:pPr>
+            <w:r>
+              <w:rPr>
+                <w:rFonts w:ascii="Calibri" w:hAnsi="Calibri" w:eastAsia="Microsoft JhengHei"/>
+                <w:b w:val="0"/>
+                <w:color w:val="000000"/>
+                <w:sz w:val="19"/>
+              </w:rPr>
+              <w:t>10/23</w:t>
+              <w:br/>
+              <w:t>週五</w:t>
+            </w:r>
+          </w:p>
+        </w:tc>
+        <w:tc>
+          <w:tcPr>
+            <w:tcW w:type="dxa" w:w="2750"/>
+            <w:tcMar>
+              <w:top w:w="80" w:type="dxa"/>
+              <w:start w:w="120" w:type="dxa"/>
+              <w:bottom w:w="80" w:type="dxa"/>
+              <w:end w:w="120" w:type="dxa"/>
+            </w:tcMar>
+            <w:vAlign w:val="center"/>
+          </w:tcPr>
+          <w:p>
+            <w:pPr>
+              <w:spacing w:after="0"/>
+              <w:jc w:val="left"/>
+            </w:pPr>
+            <w:r>
+              <w:rPr>
+                <w:rFonts w:ascii="Calibri" w:hAnsi="Calibri" w:eastAsia="Microsoft JhengHei"/>
+                <w:b w:val="0"/>
+                <w:color w:val="000000"/>
+                <w:sz w:val="19"/>
+              </w:rPr>
+              <w:t>Bike: Endurance （如果颱風天放假）</w:t>
+            </w:r>
+          </w:p>
+        </w:tc>
+        <w:tc>
+          <w:tcPr>
+            <w:tcW w:type="dxa" w:w="1050"/>
+            <w:tcMar>
+              <w:top w:w="80" w:type="dxa"/>
+              <w:start w:w="120" w:type="dxa"/>
+              <w:bottom w:w="80" w:type="dxa"/>
+              <w:end w:w="120" w:type="dxa"/>
+            </w:tcMar>
+            <w:vAlign w:val="center"/>
+          </w:tcPr>
+          <w:p>
+            <w:pPr>
+              <w:spacing w:after="0"/>
+              <w:jc w:val="center"/>
+            </w:pPr>
+            <w:r>
+              <w:rPr>
+                <w:rFonts w:ascii="Calibri" w:hAnsi="Calibri" w:eastAsia="Microsoft JhengHei"/>
+                <w:b w:val="0"/>
+                <w:color w:val="000000"/>
+                <w:sz w:val="19"/>
+              </w:rPr>
+              <w:t>Bike</w:t>
+            </w:r>
+          </w:p>
+        </w:tc>
+        <w:tc>
+          <w:tcPr>
+            <w:tcW w:type="dxa" w:w="1500"/>
+            <w:tcMar>
+              <w:top w:w="80" w:type="dxa"/>
+              <w:start w:w="120" w:type="dxa"/>
+              <w:bottom w:w="80" w:type="dxa"/>
+              <w:end w:w="120" w:type="dxa"/>
+            </w:tcMar>
+            <w:vAlign w:val="center"/>
+          </w:tcPr>
+          <w:p>
+            <w:pPr>
+              <w:spacing w:after="0"/>
+              <w:jc w:val="center"/>
+            </w:pPr>
+            <w:r>
+              <w:rPr>
+                <w:rFonts w:ascii="Calibri" w:hAnsi="Calibri" w:eastAsia="Microsoft JhengHei"/>
+                <w:b w:val="0"/>
+                <w:color w:val="000000"/>
+                <w:sz w:val="19"/>
+              </w:rPr>
+              <w:t>60分</w:t>
             </w:r>
           </w:p>
         </w:tc>
@@ -3013,7 +3179,7 @@
     </w:p>
     <w:p>
       <w:r>
-        <w:t>• 當週累積自行車 0.00 km、跑步 10.32 km、游泳 0.00 km，整體時間執行率達 13.0%。</w:t>
+        <w:t>• 當週累積自行車 33.55 km、跑步 10.32 km、游泳 3.10 km，整體時間執行率達 32.0%。</w:t>
         <w:br/>
       </w:r>
       <w:r>

</xml_diff>

<commit_message>
Auto Daily 8:00 PM Dashboard Update [2026-10-23 20:00]
</commit_message>
<xml_diff>
--- a/docs/weekly/2026-W43_當週執行率回顧報告.docx
+++ b/docs/weekly/2026-W43_當週執行率回顧報告.docx
@@ -21,7 +21,7 @@
           <w:color w:val="555555"/>
           <w:sz w:val="20"/>
         </w:rPr>
-        <w:t>週期：2026/10/19–2026/10/25　｜　整體時間執行率：32.0%</w:t>
+        <w:t>週期：2026/10/19–2026/10/25　｜　整體時間執行率：46.7%</w:t>
       </w:r>
     </w:p>
     <w:p>
@@ -320,7 +320,7 @@
                 <w:color w:val="000000"/>
                 <w:sz w:val="19"/>
               </w:rPr>
-              <w:t>3.00 hr</w:t>
+              <w:t>2.00 hr</w:t>
             </w:r>
           </w:p>
         </w:tc>
@@ -374,7 +374,7 @@
                 <w:color w:val="000000"/>
                 <w:sz w:val="19"/>
               </w:rPr>
-              <w:t>34.4%</w:t>
+              <w:t>51.7%</w:t>
             </w:r>
           </w:p>
         </w:tc>
@@ -482,7 +482,7 @@
                 <w:color w:val="000000"/>
                 <w:sz w:val="19"/>
               </w:rPr>
-              <w:t>3</w:t>
+              <w:t>2</w:t>
             </w:r>
           </w:p>
         </w:tc>
@@ -565,7 +565,7 @@
                 <w:color w:val="000000"/>
                 <w:sz w:val="19"/>
               </w:rPr>
-              <w:t>1.00 hr</w:t>
+              <w:t>2.00 hr</w:t>
             </w:r>
           </w:p>
         </w:tc>
@@ -592,7 +592,7 @@
                 <w:color w:val="000000"/>
                 <w:sz w:val="19"/>
               </w:rPr>
-              <w:t>25.0%</w:t>
+              <w:t>50.0%</w:t>
             </w:r>
           </w:p>
         </w:tc>
@@ -646,7 +646,7 @@
                 <w:color w:val="000000"/>
                 <w:sz w:val="19"/>
               </w:rPr>
-              <w:t>33.55 km</w:t>
+              <w:t>62.87 km</w:t>
             </w:r>
           </w:p>
         </w:tc>
@@ -2295,7 +2295,7 @@
                 <w:color w:val="000000"/>
                 <w:sz w:val="19"/>
               </w:rPr>
-              <w:t>0分</w:t>
+              <w:t>60分 / 29.32km</w:t>
             </w:r>
           </w:p>
         </w:tc>
@@ -2322,173 +2322,7 @@
                 <w:color w:val="000000"/>
                 <w:sz w:val="19"/>
               </w:rPr>
-              <w:t>❌ 未執行/待排程</w:t>
-            </w:r>
-          </w:p>
-        </w:tc>
-      </w:tr>
-      <w:tr>
-        <w:tc>
-          <w:tcPr>
-            <w:tcW w:type="dxa" w:w="1050"/>
-            <w:tcMar>
-              <w:top w:w="80" w:type="dxa"/>
-              <w:start w:w="120" w:type="dxa"/>
-              <w:bottom w:w="80" w:type="dxa"/>
-              <w:end w:w="120" w:type="dxa"/>
-            </w:tcMar>
-            <w:vAlign w:val="center"/>
-          </w:tcPr>
-          <w:p>
-            <w:pPr>
-              <w:spacing w:after="0"/>
-              <w:jc w:val="center"/>
-            </w:pPr>
-            <w:r>
-              <w:rPr>
-                <w:rFonts w:ascii="Calibri" w:hAnsi="Calibri" w:eastAsia="Microsoft JhengHei"/>
-                <w:b w:val="0"/>
-                <w:color w:val="000000"/>
-                <w:sz w:val="19"/>
-              </w:rPr>
-              <w:t>10/23</w:t>
-              <w:br/>
-              <w:t>週五</w:t>
-            </w:r>
-          </w:p>
-        </w:tc>
-        <w:tc>
-          <w:tcPr>
-            <w:tcW w:type="dxa" w:w="2750"/>
-            <w:tcMar>
-              <w:top w:w="80" w:type="dxa"/>
-              <w:start w:w="120" w:type="dxa"/>
-              <w:bottom w:w="80" w:type="dxa"/>
-              <w:end w:w="120" w:type="dxa"/>
-            </w:tcMar>
-            <w:vAlign w:val="center"/>
-          </w:tcPr>
-          <w:p>
-            <w:pPr>
-              <w:spacing w:after="0"/>
-              <w:jc w:val="left"/>
-            </w:pPr>
-            <w:r>
-              <w:rPr>
-                <w:rFonts w:ascii="Calibri" w:hAnsi="Calibri" w:eastAsia="Microsoft JhengHei"/>
-                <w:b w:val="0"/>
-                <w:color w:val="000000"/>
-                <w:sz w:val="19"/>
-              </w:rPr>
-              <w:t>Swim: 甜甜課表</w:t>
-            </w:r>
-          </w:p>
-        </w:tc>
-        <w:tc>
-          <w:tcPr>
-            <w:tcW w:type="dxa" w:w="1050"/>
-            <w:tcMar>
-              <w:top w:w="80" w:type="dxa"/>
-              <w:start w:w="120" w:type="dxa"/>
-              <w:bottom w:w="80" w:type="dxa"/>
-              <w:end w:w="120" w:type="dxa"/>
-            </w:tcMar>
-            <w:vAlign w:val="center"/>
-          </w:tcPr>
-          <w:p>
-            <w:pPr>
-              <w:spacing w:after="0"/>
-              <w:jc w:val="center"/>
-            </w:pPr>
-            <w:r>
-              <w:rPr>
-                <w:rFonts w:ascii="Calibri" w:hAnsi="Calibri" w:eastAsia="Microsoft JhengHei"/>
-                <w:b w:val="0"/>
-                <w:color w:val="000000"/>
-                <w:sz w:val="19"/>
-              </w:rPr>
-              <w:t>Swim</w:t>
-            </w:r>
-          </w:p>
-        </w:tc>
-        <w:tc>
-          <w:tcPr>
-            <w:tcW w:type="dxa" w:w="1500"/>
-            <w:tcMar>
-              <w:top w:w="80" w:type="dxa"/>
-              <w:start w:w="120" w:type="dxa"/>
-              <w:bottom w:w="80" w:type="dxa"/>
-              <w:end w:w="120" w:type="dxa"/>
-            </w:tcMar>
-            <w:vAlign w:val="center"/>
-          </w:tcPr>
-          <w:p>
-            <w:pPr>
-              <w:spacing w:after="0"/>
-              <w:jc w:val="center"/>
-            </w:pPr>
-            <w:r>
-              <w:rPr>
-                <w:rFonts w:ascii="Calibri" w:hAnsi="Calibri" w:eastAsia="Microsoft JhengHei"/>
-                <w:b w:val="0"/>
-                <w:color w:val="000000"/>
-                <w:sz w:val="19"/>
-              </w:rPr>
-              <w:t>60分</w:t>
-            </w:r>
-          </w:p>
-        </w:tc>
-        <w:tc>
-          <w:tcPr>
-            <w:tcW w:type="dxa" w:w="1500"/>
-            <w:tcMar>
-              <w:top w:w="80" w:type="dxa"/>
-              <w:start w:w="120" w:type="dxa"/>
-              <w:bottom w:w="80" w:type="dxa"/>
-              <w:end w:w="120" w:type="dxa"/>
-            </w:tcMar>
-            <w:vAlign w:val="center"/>
-          </w:tcPr>
-          <w:p>
-            <w:pPr>
-              <w:spacing w:after="0"/>
-              <w:jc w:val="center"/>
-            </w:pPr>
-            <w:r>
-              <w:rPr>
-                <w:rFonts w:ascii="Calibri" w:hAnsi="Calibri" w:eastAsia="Microsoft JhengHei"/>
-                <w:b w:val="0"/>
-                <w:color w:val="000000"/>
-                <w:sz w:val="19"/>
-              </w:rPr>
-              <w:t>0分</w:t>
-            </w:r>
-          </w:p>
-        </w:tc>
-        <w:tc>
-          <w:tcPr>
-            <w:tcW w:type="dxa" w:w="1810"/>
-            <w:tcMar>
-              <w:top w:w="80" w:type="dxa"/>
-              <w:start w:w="120" w:type="dxa"/>
-              <w:bottom w:w="80" w:type="dxa"/>
-              <w:end w:w="120" w:type="dxa"/>
-            </w:tcMar>
-            <w:vAlign w:val="center"/>
-          </w:tcPr>
-          <w:p>
-            <w:pPr>
-              <w:spacing w:after="0"/>
-              <w:jc w:val="center"/>
-            </w:pPr>
-            <w:r>
-              <w:rPr>
-                <w:rFonts w:ascii="Calibri" w:hAnsi="Calibri" w:eastAsia="Microsoft JhengHei"/>
-                <w:b w:val="0"/>
-                <w:color w:val="000000"/>
-                <w:sz w:val="19"/>
-              </w:rPr>
-              <w:t>❌ 未執行/待排程</w:t>
+              <w:t>✅ 精準達標 (100%, A+)</w:t>
             </w:r>
           </w:p>
         </w:tc>
@@ -3179,7 +3013,7 @@
     </w:p>
     <w:p>
       <w:r>
-        <w:t>• 當週累積自行車 33.55 km、跑步 10.32 km、游泳 3.10 km，整體時間執行率達 32.0%。</w:t>
+        <w:t>• 當週累積自行車 62.87 km、跑步 10.32 km、游泳 3.10 km，整體時間執行率達 46.7%。</w:t>
         <w:br/>
       </w:r>
       <w:r>

</xml_diff>

<commit_message>
Auto Daily 8:00 PM Dashboard Update [2026-10-24 21:21]
</commit_message>
<xml_diff>
--- a/docs/weekly/2026-W43_當週執行率回顧報告.docx
+++ b/docs/weekly/2026-W43_當週執行率回顧報告.docx
@@ -21,7 +21,7 @@
           <w:color w:val="555555"/>
           <w:sz w:val="20"/>
         </w:rPr>
-        <w:t>週期：2026/10/19–2026/10/25　｜　整體時間執行率：46.7%</w:t>
+        <w:t>週期：2026/10/19–2026/10/25　｜　整體時間執行率：68.9%</w:t>
       </w:r>
     </w:p>
     <w:p>
@@ -565,7 +565,7 @@
                 <w:color w:val="000000"/>
                 <w:sz w:val="19"/>
               </w:rPr>
-              <w:t>2.00 hr</w:t>
+              <w:t>4.00 hr</w:t>
             </w:r>
           </w:p>
         </w:tc>
@@ -592,7 +592,7 @@
                 <w:color w:val="000000"/>
                 <w:sz w:val="19"/>
               </w:rPr>
-              <w:t>50.0%</w:t>
+              <w:t>100.0%</w:t>
             </w:r>
           </w:p>
         </w:tc>
@@ -646,7 +646,7 @@
                 <w:color w:val="000000"/>
                 <w:sz w:val="19"/>
               </w:rPr>
-              <w:t>62.87 km</w:t>
+              <w:t>119.85 km</w:t>
             </w:r>
           </w:p>
         </w:tc>
@@ -2461,7 +2461,7 @@
                 <w:color w:val="000000"/>
                 <w:sz w:val="19"/>
               </w:rPr>
-              <w:t>0分</w:t>
+              <w:t>120分 / 56.98km</w:t>
             </w:r>
           </w:p>
         </w:tc>
@@ -2488,7 +2488,7 @@
                 <w:color w:val="000000"/>
                 <w:sz w:val="19"/>
               </w:rPr>
-              <w:t>❌ 未執行/待排程</w:t>
+              <w:t>✅ 精準達標 (100%, A+)</w:t>
             </w:r>
           </w:p>
         </w:tc>
@@ -3013,7 +3013,11 @@
     </w:p>
     <w:p>
       <w:r>
-        <w:t>• 當週累積自行車 62.87 km、跑步 10.32 km、游泳 3.10 km，整體時間執行率達 46.7%。</w:t>
+        <w:t>• 當週累積自行車 119.85 km、跑步 10.32 km、游泳 3.10 km，整體時間執行率達 68.9%。</w:t>
+        <w:br/>
+      </w:r>
+      <w:r>
+        <w:t>• 長距離單車扎實完成，左右踩踏發力極為平衡 (50.5% / 49.5%)，座艙穩定度高。</w:t>
         <w:br/>
       </w:r>
       <w:r>

</xml_diff>

<commit_message>
Auto Daily 8:00 PM Dashboard Update [2026-10-25 20:00]
</commit_message>
<xml_diff>
--- a/docs/weekly/2026-W43_當週執行率回顧報告.docx
+++ b/docs/weekly/2026-W43_當週執行率回顧報告.docx
@@ -21,7 +21,7 @@
           <w:color w:val="555555"/>
           <w:sz w:val="20"/>
         </w:rPr>
-        <w:t>週期：2026/10/19–2026/10/25　｜　整體時間執行率：68.9%</w:t>
+        <w:t>週期：2026/10/19–2026/10/25　｜　整體時間執行率：92.8%</w:t>
       </w:r>
     </w:p>
     <w:p>
@@ -347,7 +347,7 @@
                 <w:color w:val="000000"/>
                 <w:sz w:val="19"/>
               </w:rPr>
-              <w:t>1.03 hr</w:t>
+              <w:t>1.93 hr</w:t>
             </w:r>
           </w:p>
         </w:tc>
@@ -374,7 +374,7 @@
                 <w:color w:val="000000"/>
                 <w:sz w:val="19"/>
               </w:rPr>
-              <w:t>51.7%</w:t>
+              <w:t>96.7%</w:t>
             </w:r>
           </w:p>
         </w:tc>
@@ -428,7 +428,7 @@
                 <w:color w:val="000000"/>
                 <w:sz w:val="19"/>
               </w:rPr>
-              <w:t>3.10 km</w:t>
+              <w:t>5.55 km</w:t>
             </w:r>
           </w:p>
         </w:tc>
@@ -455,7 +455,7 @@
                 <w:color w:val="000000"/>
                 <w:sz w:val="19"/>
               </w:rPr>
-              <w:t>134.8%</w:t>
+              <w:t>241.3%</w:t>
             </w:r>
           </w:p>
         </w:tc>
@@ -783,7 +783,7 @@
                 <w:color w:val="000000"/>
                 <w:sz w:val="19"/>
               </w:rPr>
-              <w:t>1.17 hr</w:t>
+              <w:t>2.42 hr</w:t>
             </w:r>
           </w:p>
         </w:tc>
@@ -810,7 +810,7 @@
                 <w:color w:val="000000"/>
                 <w:sz w:val="19"/>
               </w:rPr>
-              <w:t>38.9%</w:t>
+              <w:t>80.6%</w:t>
             </w:r>
           </w:p>
         </w:tc>
@@ -864,7 +864,7 @@
                 <w:color w:val="000000"/>
                 <w:sz w:val="19"/>
               </w:rPr>
-              <w:t>10.32 km</w:t>
+              <w:t>23.81 km</w:t>
             </w:r>
           </w:p>
         </w:tc>
@@ -891,7 +891,7 @@
                 <w:color w:val="000000"/>
                 <w:sz w:val="19"/>
               </w:rPr>
-              <w:t>107.5%</w:t>
+              <w:t>248.0%</w:t>
             </w:r>
           </w:p>
         </w:tc>
@@ -2793,7 +2793,7 @@
                 <w:color w:val="000000"/>
                 <w:sz w:val="19"/>
               </w:rPr>
-              <w:t>0分</w:t>
+              <w:t>75分 / 13.49km</w:t>
             </w:r>
           </w:p>
         </w:tc>
@@ -2820,7 +2820,7 @@
                 <w:color w:val="000000"/>
                 <w:sz w:val="19"/>
               </w:rPr>
-              <w:t>❌ 未執行/待排程</w:t>
+              <w:t>✅ 精準達標 (100%, A+)</w:t>
             </w:r>
           </w:p>
         </w:tc>
@@ -2959,7 +2959,7 @@
                 <w:color w:val="000000"/>
                 <w:sz w:val="19"/>
               </w:rPr>
-              <w:t>0分</w:t>
+              <w:t>54分 / 2.45km</w:t>
             </w:r>
           </w:p>
         </w:tc>
@@ -2986,7 +2986,7 @@
                 <w:color w:val="000000"/>
                 <w:sz w:val="19"/>
               </w:rPr>
-              <w:t>❌ 未執行/待排程</w:t>
+              <w:t>🟢 良好達標 (90%, A-)</w:t>
             </w:r>
           </w:p>
         </w:tc>
@@ -3013,7 +3013,7 @@
     </w:p>
     <w:p>
       <w:r>
-        <w:t>• 當週累積自行車 119.85 km、跑步 10.32 km、游泳 3.10 km，整體時間執行率達 68.9%。</w:t>
+        <w:t>• 當週累積自行車 119.85 km、跑步 23.81 km、游泳 5.55 km，整體時間執行率達 92.8%。</w:t>
         <w:br/>
       </w:r>
       <w:r>

</xml_diff>